<commit_message>
v5.1: update contractor guides for pending/paid invoice statuses
Regenerate CONTRACTOR_GUIDE.docx (en) and CONTRACTOR_GUIDE.pt-BR.docx
to match the simplified invoice lifecycle introduced in v4.9:
- Intro workflow description
- Status badge table (remove Approved and Rejected rows)
- "If rejected" guidance replaced with "ask admin to flip back to
  Pending" since rejection is no longer a first-class state
- FAQ entry about Rejected invoices removed
- Matching edits in the Portuguese guide

Co-Authored-By: Claude Sonnet 4.6 <noreply@anthropic.com>
</commit_message>
<xml_diff>
--- a/docs/CONTRACTOR_GUIDE.docx
+++ b/docs/CONTRACTOR_GUIDE.docx
@@ -16,7 +16,19 @@
         <w:pStyle w:val="FirstParagraph"/>
       </w:pPr>
       <w:r>
-        <w:t xml:space="preserve">Welcome to LedgerX. This guide walks you through everything you need to know as a contractor: signing in, submitting receipts, submitting invoices, and checking the status of your work.</w:t>
+        <w:t xml:space="preserve">Welcome to LedgerX. This guide walks you through everything you need to</w:t>
+      </w:r>
+      <w:r>
+        <w:t xml:space="preserve"> </w:t>
+      </w:r>
+      <w:r>
+        <w:t xml:space="preserve">know as a contractor: signing in, submitting receipts, submitting</w:t>
+      </w:r>
+      <w:r>
+        <w:t xml:space="preserve"> </w:t>
+      </w:r>
+      <w:r>
+        <w:t xml:space="preserve">invoices, and checking the status of your work.</w:t>
       </w:r>
     </w:p>
     <w:p>
@@ -29,6 +41,71 @@
       <w:r>
         <w:t xml:space="preserve"> </w:t>
       </w:r>
+      <w:hyperlink w:anchor="the-30-second-version">
+        <w:r>
+          <w:rPr>
+            <w:rStyle w:val="Hyperlink"/>
+          </w:rPr>
+          <w:t xml:space="preserve">The 30-Second</w:t>
+        </w:r>
+        <w:r>
+          <w:rPr>
+            <w:rStyle w:val="Hyperlink"/>
+          </w:rPr>
+          <w:t xml:space="preserve"> </w:t>
+        </w:r>
+        <w:r>
+          <w:rPr>
+            <w:rStyle w:val="Hyperlink"/>
+          </w:rPr>
+          <w:t xml:space="preserve">Version</w:t>
+        </w:r>
+      </w:hyperlink>
+      <w:r>
+        <w:t xml:space="preserve">.</w:t>
+      </w:r>
+    </w:p>
+    <w:p>
+      <w:r>
+        <w:pict>
+          <v:rect style="width:0;height:1.5pt" o:hralign="center" o:hrstd="t" o:hr="t"/>
+        </w:pict>
+      </w:r>
+    </w:p>
+    <w:bookmarkStart w:id="9" w:name="table-of-contents"/>
+    <w:p>
+      <w:pPr>
+        <w:pStyle w:val="Heading2"/>
+      </w:pPr>
+      <w:r>
+        <w:t xml:space="preserve">Table of Contents</w:t>
+      </w:r>
+    </w:p>
+    <w:p>
+      <w:pPr>
+        <w:pStyle w:val="Compact"/>
+        <w:numPr>
+          <w:ilvl w:val="0"/>
+          <w:numId w:val="1001"/>
+        </w:numPr>
+      </w:pPr>
+      <w:hyperlink w:anchor="introduction">
+        <w:r>
+          <w:rPr>
+            <w:rStyle w:val="Hyperlink"/>
+          </w:rPr>
+          <w:t xml:space="preserve">Introduction</w:t>
+        </w:r>
+      </w:hyperlink>
+    </w:p>
+    <w:p>
+      <w:pPr>
+        <w:pStyle w:val="Compact"/>
+        <w:numPr>
+          <w:ilvl w:val="0"/>
+          <w:numId w:val="1001"/>
+        </w:numPr>
+      </w:pPr>
       <w:hyperlink w:anchor="the-30-second-version">
         <w:r>
           <w:rPr>
@@ -37,59 +114,6 @@
           <w:t xml:space="preserve">The 30-Second Version</w:t>
         </w:r>
       </w:hyperlink>
-      <w:r>
-        <w:t xml:space="preserve">.</w:t>
-      </w:r>
-    </w:p>
-    <w:p>
-      <w:r>
-        <w:pict>
-          <v:rect style="width:0;height:1.5pt" o:hralign="center" o:hrstd="t" o:hr="t"/>
-        </w:pict>
-      </w:r>
-    </w:p>
-    <w:bookmarkStart w:id="9" w:name="table-of-contents"/>
-    <w:p>
-      <w:pPr>
-        <w:pStyle w:val="Heading2"/>
-      </w:pPr>
-      <w:r>
-        <w:t xml:space="preserve">Table of Contents</w:t>
-      </w:r>
-    </w:p>
-    <w:p>
-      <w:pPr>
-        <w:pStyle w:val="Compact"/>
-        <w:numPr>
-          <w:ilvl w:val="0"/>
-          <w:numId w:val="1001"/>
-        </w:numPr>
-      </w:pPr>
-      <w:hyperlink w:anchor="introduction">
-        <w:r>
-          <w:rPr>
-            <w:rStyle w:val="Hyperlink"/>
-          </w:rPr>
-          <w:t xml:space="preserve">Introduction</w:t>
-        </w:r>
-      </w:hyperlink>
-    </w:p>
-    <w:p>
-      <w:pPr>
-        <w:pStyle w:val="Compact"/>
-        <w:numPr>
-          <w:ilvl w:val="0"/>
-          <w:numId w:val="1001"/>
-        </w:numPr>
-      </w:pPr>
-      <w:hyperlink w:anchor="the-30-second-version">
-        <w:r>
-          <w:rPr>
-            <w:rStyle w:val="Hyperlink"/>
-          </w:rPr>
-          <w:t xml:space="preserve">The 30-Second Version</w:t>
-        </w:r>
-      </w:hyperlink>
     </w:p>
     <w:p>
       <w:pPr>
@@ -138,7 +162,19 @@
           <w:rPr>
             <w:rStyle w:val="Hyperlink"/>
           </w:rPr>
-          <w:t xml:space="preserve">Submitting a Receipt (Add Transaction)</w:t>
+          <w:t xml:space="preserve">Submitting a Receipt (Add</w:t>
+        </w:r>
+        <w:r>
+          <w:rPr>
+            <w:rStyle w:val="Hyperlink"/>
+          </w:rPr>
+          <w:t xml:space="preserve"> </w:t>
+        </w:r>
+        <w:r>
+          <w:rPr>
+            <w:rStyle w:val="Hyperlink"/>
+          </w:rPr>
+          <w:t xml:space="preserve">Transaction)</w:t>
         </w:r>
       </w:hyperlink>
     </w:p>
@@ -300,7 +336,13 @@
         <w:pStyle w:val="FirstParagraph"/>
       </w:pPr>
       <w:r>
-        <w:t xml:space="preserve">LedgerX is the expense and invoice tracking system used by your property manager or admin. As a contractor, you use it for two things:</w:t>
+        <w:t xml:space="preserve">LedgerX is the expense and invoice tracking system used by your property</w:t>
+      </w:r>
+      <w:r>
+        <w:t xml:space="preserve"> </w:t>
+      </w:r>
+      <w:r>
+        <w:t xml:space="preserve">manager or admin. As a contractor, you use it for two things:</w:t>
       </w:r>
     </w:p>
     <w:p>
@@ -322,7 +364,13 @@
         <w:t xml:space="preserve"> </w:t>
       </w:r>
       <w:r>
-        <w:t xml:space="preserve">— proof of purchases you made on behalf of a property (materials, supplies, gas, etc.). These are logged as</w:t>
+        <w:t xml:space="preserve">— proof of purchases you made on behalf of</w:t>
+      </w:r>
+      <w:r>
+        <w:t xml:space="preserve"> </w:t>
+      </w:r>
+      <w:r>
+        <w:t xml:space="preserve">a property (materials, supplies, gas, etc.). These are logged as</w:t>
       </w:r>
       <w:r>
         <w:t xml:space="preserve"> </w:t>
@@ -357,7 +405,19 @@
         <w:t xml:space="preserve"> </w:t>
       </w:r>
       <w:r>
-        <w:t xml:space="preserve">— your own bills for the work you performed. These go through a review cycle: Pending → Approved → Paid (or Rejected with an explanation).</w:t>
+        <w:t xml:space="preserve">— your own bills for the work you</w:t>
+      </w:r>
+      <w:r>
+        <w:t xml:space="preserve"> </w:t>
+      </w:r>
+      <w:r>
+        <w:t xml:space="preserve">performed. These start as Pending and flip to Paid once your admin</w:t>
+      </w:r>
+      <w:r>
+        <w:t xml:space="preserve"> </w:t>
+      </w:r>
+      <w:r>
+        <w:t xml:space="preserve">issues payment.</w:t>
       </w:r>
     </w:p>
     <w:p>
@@ -365,7 +425,31 @@
         <w:pStyle w:val="FirstParagraph"/>
       </w:pPr>
       <w:r>
-        <w:t xml:space="preserve">Everything you send through LedgerX goes straight to the admin responsible for the property. You don’t email anyone, you don’t attach files to texts, you don’t lose a receipt in your glove box. You open the app, upload a photo or PDF, and the app reads most of the details for you. Your only job is to double-check what it read.</w:t>
+        <w:t xml:space="preserve">Everything you send through LedgerX goes straight to the admin</w:t>
+      </w:r>
+      <w:r>
+        <w:t xml:space="preserve"> </w:t>
+      </w:r>
+      <w:r>
+        <w:t xml:space="preserve">responsible for the property. You don’t email anyone, you don’t attach</w:t>
+      </w:r>
+      <w:r>
+        <w:t xml:space="preserve"> </w:t>
+      </w:r>
+      <w:r>
+        <w:t xml:space="preserve">files to texts, you don’t lose a receipt in your glove box. You open the</w:t>
+      </w:r>
+      <w:r>
+        <w:t xml:space="preserve"> </w:t>
+      </w:r>
+      <w:r>
+        <w:t xml:space="preserve">app, upload a photo or PDF, and the app reads most of the details for</w:t>
+      </w:r>
+      <w:r>
+        <w:t xml:space="preserve"> </w:t>
+      </w:r>
+      <w:r>
+        <w:t xml:space="preserve">you. Your only job is to double-check what it read.</w:t>
       </w:r>
     </w:p>
     <w:p>
@@ -407,7 +491,13 @@
         <w:t xml:space="preserve">ledger.phillyshah.com</w:t>
       </w:r>
       <w:r>
-        <w:t xml:space="preserve">, sign in with your username and password.</w:t>
+        <w:t xml:space="preserve">, sign in with your username and</w:t>
+      </w:r>
+      <w:r>
+        <w:t xml:space="preserve"> </w:t>
+      </w:r>
+      <w:r>
+        <w:t xml:space="preserve">password.</w:t>
       </w:r>
     </w:p>
     <w:p>
@@ -463,7 +553,13 @@
         </w:numPr>
       </w:pPr>
       <w:r>
-        <w:t xml:space="preserve">Upload the photo or PDF. The app reads it for you. Fix anything it got wrong.</w:t>
+        <w:t xml:space="preserve">Upload the photo or PDF. The app reads it for you. Fix anything it</w:t>
+      </w:r>
+      <w:r>
+        <w:t xml:space="preserve"> </w:t>
+      </w:r>
+      <w:r>
+        <w:t xml:space="preserve">got wrong.</w:t>
       </w:r>
     </w:p>
     <w:p>
@@ -516,23 +612,7 @@
         </w:numPr>
       </w:pPr>
       <w:r>
-        <w:t xml:space="preserve">Come back anytime to see if your invoice has been</w:t>
-      </w:r>
-      <w:r>
-        <w:t xml:space="preserve"> </w:t>
-      </w:r>
-      <w:r>
-        <w:rPr>
-          <w:b/>
-          <w:bCs/>
-        </w:rPr>
-        <w:t xml:space="preserve">Approved</w:t>
-      </w:r>
-      <w:r>
-        <w:t xml:space="preserve"> </w:t>
-      </w:r>
-      <w:r>
-        <w:t xml:space="preserve">or</w:t>
+        <w:t xml:space="preserve">Come back anytime to see if your invoice has been marked</w:t>
       </w:r>
       <w:r>
         <w:t xml:space="preserve"> </w:t>
@@ -553,7 +633,13 @@
         <w:pStyle w:val="FirstParagraph"/>
       </w:pPr>
       <w:r>
-        <w:t xml:space="preserve">That’s it. The rest of this guide is the detail for when something isn’t obvious.</w:t>
+        <w:t xml:space="preserve">That’s it. The rest of this guide is the detail for when something isn’t</w:t>
+      </w:r>
+      <w:r>
+        <w:t xml:space="preserve"> </w:t>
+      </w:r>
+      <w:r>
+        <w:t xml:space="preserve">obvious.</w:t>
       </w:r>
     </w:p>
     <w:p>
@@ -682,7 +768,13 @@
         <w:t xml:space="preserve"> </w:t>
       </w:r>
       <w:r>
-        <w:t xml:space="preserve">LedgerX uses a username — not an email — to sign in. You don’t need to remember an email address.</w:t>
+        <w:t xml:space="preserve">LedgerX uses a username — not an email — to sign in. You</w:t>
+      </w:r>
+      <w:r>
+        <w:t xml:space="preserve"> </w:t>
+      </w:r>
+      <w:r>
+        <w:t xml:space="preserve">don’t need to remember an email address.</w:t>
       </w:r>
     </w:p>
     <w:p>
@@ -729,13 +821,33 @@
           <w:b/>
           <w:bCs/>
         </w:rPr>
-        <w:t xml:space="preserve">Forgot password?</w:t>
-      </w:r>
-      <w:r>
-        <w:t xml:space="preserve"> </w:t>
-      </w:r>
-      <w:r>
-        <w:t xml:space="preserve">on the sign-in screen and a reset link will be emailed to you.</w:t>
+        <w:t xml:space="preserve">Forgot</w:t>
+      </w:r>
+      <w:r>
+        <w:rPr>
+          <w:b/>
+          <w:bCs/>
+        </w:rPr>
+        <w:t xml:space="preserve"> </w:t>
+      </w:r>
+      <w:r>
+        <w:rPr>
+          <w:b/>
+          <w:bCs/>
+        </w:rPr>
+        <w:t xml:space="preserve">password?</w:t>
+      </w:r>
+      <w:r>
+        <w:t xml:space="preserve"> </w:t>
+      </w:r>
+      <w:r>
+        <w:t xml:space="preserve">on the sign-in screen and a reset link will be emailed to</w:t>
+      </w:r>
+      <w:r>
+        <w:t xml:space="preserve"> </w:t>
+      </w:r>
+      <w:r>
+        <w:t xml:space="preserve">you.</w:t>
       </w:r>
     </w:p>
     <w:p>
@@ -747,7 +859,13 @@
         </w:numPr>
       </w:pPr>
       <w:r>
-        <w:t xml:space="preserve">If you haven’t added an email yet, message your admin and ask them to reset it. Next time you sign in, open</w:t>
+        <w:t xml:space="preserve">If you haven’t added an email yet, message your admin and ask them to</w:t>
+      </w:r>
+      <w:r>
+        <w:t xml:space="preserve"> </w:t>
+      </w:r>
+      <w:r>
+        <w:t xml:space="preserve">reset it. Next time you sign in, open</w:t>
       </w:r>
       <w:r>
         <w:t xml:space="preserve"> </w:t>
@@ -763,7 +881,13 @@
         <w:t xml:space="preserve"> </w:t>
       </w:r>
       <w:r>
-        <w:t xml:space="preserve">and add an email so you can reset it yourself in the future.</w:t>
+        <w:t xml:space="preserve">and add an email so</w:t>
+      </w:r>
+      <w:r>
+        <w:t xml:space="preserve"> </w:t>
+      </w:r>
+      <w:r>
+        <w:t xml:space="preserve">you can reset it yourself in the future.</w:t>
       </w:r>
     </w:p>
     <w:p>
@@ -781,7 +905,13 @@
         <w:t xml:space="preserve"> </w:t>
       </w:r>
       <w:r>
-        <w:t xml:space="preserve">On iPhone, tap the Share button →</w:t>
+        <w:t xml:space="preserve">On iPhone, tap the</w:t>
+      </w:r>
+      <w:r>
+        <w:t xml:space="preserve"> </w:t>
+      </w:r>
+      <w:r>
+        <w:t xml:space="preserve">Share button →</w:t>
       </w:r>
       <w:r>
         <w:t xml:space="preserve"> </w:t>
@@ -794,7 +924,13 @@
         <w:t xml:space="preserve">Add to Home Screen</w:t>
       </w:r>
       <w:r>
-        <w:t xml:space="preserve">. On Android, tap the three-dot menu →</w:t>
+        <w:t xml:space="preserve">. On Android, tap the three-dot</w:t>
+      </w:r>
+      <w:r>
+        <w:t xml:space="preserve"> </w:t>
+      </w:r>
+      <w:r>
+        <w:t xml:space="preserve">menu →</w:t>
       </w:r>
       <w:r>
         <w:t xml:space="preserve"> </w:t>
@@ -823,7 +959,13 @@
         <w:t xml:space="preserve">Add to Home screen</w:t>
       </w:r>
       <w:r>
-        <w:t xml:space="preserve">. LedgerX now opens like a regular app.</w:t>
+        <w:t xml:space="preserve">. LedgerX now opens like</w:t>
+      </w:r>
+      <w:r>
+        <w:t xml:space="preserve"> </w:t>
+      </w:r>
+      <w:r>
+        <w:t xml:space="preserve">a regular app.</w:t>
       </w:r>
     </w:p>
     <w:p>
@@ -854,13 +996,13 @@
     <w:tbl>
       <w:tblPr>
         <w:tblStyle w:val="Table"/>
-        <w:tblW w:type="pct" w:w="5000"/>
+        <w:tblW w:type="pct" w:w="4306"/>
         <w:tblLayout w:type="fixed"/>
         <w:tblLook w:firstRow="1" w:lastRow="0" w:firstColumn="0" w:lastColumn="0" w:noHBand="0" w:noVBand="0" w:val="0020"/>
       </w:tblPr>
       <w:tblGrid>
-        <w:gridCol w:w="3960"/>
-        <w:gridCol w:w="3960"/>
+        <w:gridCol w:w="3410"/>
+        <w:gridCol w:w="3410"/>
       </w:tblGrid>
       <w:tr>
         <w:trPr>
@@ -871,6 +1013,7 @@
           <w:p>
             <w:pPr>
               <w:pStyle w:val="Compact"/>
+              <w:jc w:val="left"/>
             </w:pPr>
             <w:r>
               <w:t xml:space="preserve">Button</w:t>
@@ -882,6 +1025,7 @@
           <w:p>
             <w:pPr>
               <w:pStyle w:val="Compact"/>
+              <w:jc w:val="left"/>
             </w:pPr>
             <w:r>
               <w:t xml:space="preserve">What it’s for</w:t>
@@ -895,6 +1039,7 @@
           <w:p>
             <w:pPr>
               <w:pStyle w:val="Compact"/>
+              <w:jc w:val="left"/>
             </w:pPr>
             <w:r>
               <w:rPr>
@@ -910,9 +1055,22 @@
           <w:p>
             <w:pPr>
               <w:pStyle w:val="Compact"/>
+              <w:jc w:val="left"/>
             </w:pPr>
             <w:r>
-              <w:t xml:space="preserve">Log a receipt for something you bought on behalf of a property</w:t>
+              <w:t xml:space="preserve">Log a receipt for something</w:t>
+            </w:r>
+            <w:r>
+              <w:t xml:space="preserve"> </w:t>
+            </w:r>
+            <w:r>
+              <w:t xml:space="preserve">you bought on behalf of a</w:t>
+            </w:r>
+            <w:r>
+              <w:t xml:space="preserve"> </w:t>
+            </w:r>
+            <w:r>
+              <w:t xml:space="preserve">property</w:t>
             </w:r>
           </w:p>
         </w:tc>
@@ -923,6 +1081,7 @@
           <w:p>
             <w:pPr>
               <w:pStyle w:val="Compact"/>
+              <w:jc w:val="left"/>
             </w:pPr>
             <w:r>
               <w:rPr>
@@ -938,9 +1097,16 @@
           <w:p>
             <w:pPr>
               <w:pStyle w:val="Compact"/>
+              <w:jc w:val="left"/>
             </w:pPr>
             <w:r>
-              <w:t xml:space="preserve">Send your invoice (bill) for work you performed</w:t>
+              <w:t xml:space="preserve">Send your invoice (bill) for</w:t>
+            </w:r>
+            <w:r>
+              <w:t xml:space="preserve"> </w:t>
+            </w:r>
+            <w:r>
+              <w:t xml:space="preserve">work you performed</w:t>
             </w:r>
           </w:p>
         </w:tc>
@@ -973,7 +1139,13 @@
         <w:t xml:space="preserve"> </w:t>
       </w:r>
       <w:r>
-        <w:t xml:space="preserve">— every invoice you’ve submitted, with a colored status badge (Pending, Approved, Paid, Rejected).</w:t>
+        <w:t xml:space="preserve">— every invoice you’ve submitted, with a colored</w:t>
+      </w:r>
+      <w:r>
+        <w:t xml:space="preserve"> </w:t>
+      </w:r>
+      <w:r>
+        <w:t xml:space="preserve">status badge (Pending or Paid).</w:t>
       </w:r>
     </w:p>
     <w:p>
@@ -995,7 +1167,13 @@
         <w:t xml:space="preserve"> </w:t>
       </w:r>
       <w:r>
-        <w:t xml:space="preserve">— every receipt/transaction you’ve submitted. Paid receipts get a green</w:t>
+        <w:t xml:space="preserve">— every receipt/transaction you’ve submitted. Paid</w:t>
+      </w:r>
+      <w:r>
+        <w:t xml:space="preserve"> </w:t>
+      </w:r>
+      <w:r>
+        <w:t xml:space="preserve">receipts get a green</w:t>
       </w:r>
       <w:r>
         <w:t xml:space="preserve"> </w:t>
@@ -1110,7 +1288,13 @@
         <w:pStyle w:val="FirstParagraph"/>
       </w:pPr>
       <w:r>
-        <w:t xml:space="preserve">Use this when you bought something for a property and need to be reimbursed, or when you want the purchase recorded.</w:t>
+        <w:t xml:space="preserve">Use this when you bought something for a property and need to be</w:t>
+      </w:r>
+      <w:r>
+        <w:t xml:space="preserve"> </w:t>
+      </w:r>
+      <w:r>
+        <w:t xml:space="preserve">reimbursed, or when you want the purchase recorded.</w:t>
       </w:r>
     </w:p>
     <w:p>
@@ -1147,7 +1331,13 @@
         </w:numPr>
       </w:pPr>
       <w:r>
-        <w:t xml:space="preserve">Tap the upload area and pick the receipt photo or PDF. (You can take a photo right there on your phone.)</w:t>
+        <w:t xml:space="preserve">Tap the upload area and pick the receipt photo or PDF. (You can take</w:t>
+      </w:r>
+      <w:r>
+        <w:t xml:space="preserve"> </w:t>
+      </w:r>
+      <w:r>
+        <w:t xml:space="preserve">a photo right there on your phone.)</w:t>
       </w:r>
     </w:p>
     <w:p>
@@ -1169,7 +1359,13 @@
         <w:t xml:space="preserve"> </w:t>
       </w:r>
       <w:r>
-        <w:t xml:space="preserve">Within a few seconds, it fills in:</w:t>
+        <w:t xml:space="preserve">Within a few seconds,</w:t>
+      </w:r>
+      <w:r>
+        <w:t xml:space="preserve"> </w:t>
+      </w:r>
+      <w:r>
+        <w:t xml:space="preserve">it fills in:</w:t>
       </w:r>
     </w:p>
     <w:p>
@@ -1279,7 +1475,13 @@
         <w:t xml:space="preserve"> </w:t>
       </w:r>
       <w:r>
-        <w:t xml:space="preserve">— added to the notes if visible</w:t>
+        <w:t xml:space="preserve">— added to the</w:t>
+      </w:r>
+      <w:r>
+        <w:t xml:space="preserve"> </w:t>
+      </w:r>
+      <w:r>
+        <w:t xml:space="preserve">notes if visible</w:t>
       </w:r>
     </w:p>
     <w:p>
@@ -1307,7 +1509,13 @@
         <w:t xml:space="preserve"> </w:t>
       </w:r>
       <w:r>
-        <w:t xml:space="preserve">OCR is close, but receipts with faded ink, bad lighting, or unusual layouts can trip it up.</w:t>
+        <w:t xml:space="preserve">OCR is close, but receipts with faded ink, bad lighting, or unusual</w:t>
+      </w:r>
+      <w:r>
+        <w:t xml:space="preserve"> </w:t>
+      </w:r>
+      <w:r>
+        <w:t xml:space="preserve">layouts can trip it up.</w:t>
       </w:r>
     </w:p>
     <w:p>
@@ -1409,7 +1617,13 @@
         <w:t xml:space="preserve">My Receipts</w:t>
       </w:r>
       <w:r>
-        <w:t xml:space="preserve">. The admin will see it in the system.</w:t>
+        <w:t xml:space="preserve">. The admin will see it in</w:t>
+      </w:r>
+      <w:r>
+        <w:t xml:space="preserve"> </w:t>
+      </w:r>
+      <w:r>
+        <w:t xml:space="preserve">the system.</w:t>
       </w:r>
     </w:p>
     <w:p>
@@ -1427,7 +1641,25 @@
         <w:t xml:space="preserve"> </w:t>
       </w:r>
       <w:r>
-        <w:t xml:space="preserve">You can attach as many files as you want to a single transaction — useful for long itemized receipts that span multiple pages, or when you have both the receipt and a packing slip. The first file is the one the OCR reads.</w:t>
+        <w:t xml:space="preserve">You can attach as many files as</w:t>
+      </w:r>
+      <w:r>
+        <w:t xml:space="preserve"> </w:t>
+      </w:r>
+      <w:r>
+        <w:t xml:space="preserve">you want to a single transaction — useful for long itemized receipts</w:t>
+      </w:r>
+      <w:r>
+        <w:t xml:space="preserve"> </w:t>
+      </w:r>
+      <w:r>
+        <w:t xml:space="preserve">that span multiple pages, or when you have both the receipt and a</w:t>
+      </w:r>
+      <w:r>
+        <w:t xml:space="preserve"> </w:t>
+      </w:r>
+      <w:r>
+        <w:t xml:space="preserve">packing slip. The first file is the one the OCR reads.</w:t>
       </w:r>
     </w:p>
     <w:p>
@@ -1468,7 +1700,13 @@
         <w:t xml:space="preserve"> </w:t>
       </w:r>
       <w:r>
-        <w:t xml:space="preserve">invoice — the bill you send for work you performed.</w:t>
+        <w:t xml:space="preserve">invoice — the bill you send for work you</w:t>
+      </w:r>
+      <w:r>
+        <w:t xml:space="preserve"> </w:t>
+      </w:r>
+      <w:r>
+        <w:t xml:space="preserve">performed.</w:t>
       </w:r>
     </w:p>
     <w:p>
@@ -1521,7 +1759,19 @@
         <w:t xml:space="preserve"> </w:t>
       </w:r>
       <w:r>
-        <w:t xml:space="preserve">If you generate invoices in Word or Google Docs, export to PDF and upload that.</w:t>
+        <w:t xml:space="preserve">If you</w:t>
+      </w:r>
+      <w:r>
+        <w:t xml:space="preserve"> </w:t>
+      </w:r>
+      <w:r>
+        <w:t xml:space="preserve">generate invoices in Word or Google Docs, export to PDF and upload</w:t>
+      </w:r>
+      <w:r>
+        <w:t xml:space="preserve"> </w:t>
+      </w:r>
+      <w:r>
+        <w:t xml:space="preserve">that.</w:t>
       </w:r>
     </w:p>
     <w:p>
@@ -1559,7 +1809,13 @@
         <w:t xml:space="preserve"> </w:t>
       </w:r>
       <w:r>
-        <w:t xml:space="preserve">(optional — leave blank if your invoice doesn’t have one)</w:t>
+        <w:t xml:space="preserve">(optional — leave blank if your invoice</w:t>
+      </w:r>
+      <w:r>
+        <w:t xml:space="preserve"> </w:t>
+      </w:r>
+      <w:r>
+        <w:t xml:space="preserve">doesn’t have one)</w:t>
       </w:r>
     </w:p>
     <w:p>
@@ -1635,7 +1891,13 @@
         <w:t xml:space="preserve"> </w:t>
       </w:r>
       <w:r>
-        <w:t xml:space="preserve">— the dates you performed the work</w:t>
+        <w:t xml:space="preserve">— the dates you performed the</w:t>
+      </w:r>
+      <w:r>
+        <w:t xml:space="preserve"> </w:t>
+      </w:r>
+      <w:r>
+        <w:t xml:space="preserve">work</w:t>
       </w:r>
     </w:p>
     <w:p>
@@ -1763,13 +2025,13 @@
     <w:tbl>
       <w:tblPr>
         <w:tblStyle w:val="Table"/>
-        <w:tblW w:type="pct" w:w="5000"/>
+        <w:tblW w:type="pct" w:w="4306"/>
         <w:tblLayout w:type="fixed"/>
         <w:tblLook w:firstRow="1" w:lastRow="0" w:firstColumn="0" w:lastColumn="0" w:noHBand="0" w:noVBand="0" w:val="0020"/>
       </w:tblPr>
       <w:tblGrid>
-        <w:gridCol w:w="3960"/>
-        <w:gridCol w:w="3960"/>
+        <w:gridCol w:w="3410"/>
+        <w:gridCol w:w="3410"/>
       </w:tblGrid>
       <w:tr>
         <w:trPr>
@@ -1780,6 +2042,7 @@
           <w:p>
             <w:pPr>
               <w:pStyle w:val="Compact"/>
+              <w:jc w:val="left"/>
             </w:pPr>
             <w:r>
               <w:t xml:space="preserve">Badge</w:t>
@@ -1791,6 +2054,7 @@
           <w:p>
             <w:pPr>
               <w:pStyle w:val="Compact"/>
+              <w:jc w:val="left"/>
             </w:pPr>
             <w:r>
               <w:t xml:space="preserve">Meaning</w:t>
@@ -1804,6 +2068,7 @@
           <w:p>
             <w:pPr>
               <w:pStyle w:val="Compact"/>
+              <w:jc w:val="left"/>
             </w:pPr>
             <w:r>
               <w:t xml:space="preserve">🟡</w:t>
@@ -1825,9 +2090,16 @@
           <w:p>
             <w:pPr>
               <w:pStyle w:val="Compact"/>
+              <w:jc w:val="left"/>
             </w:pPr>
             <w:r>
-              <w:t xml:space="preserve">Submitted — waiting for the admin to review</w:t>
+              <w:t xml:space="preserve">Submitted — waiting for</w:t>
+            </w:r>
+            <w:r>
+              <w:t xml:space="preserve"> </w:t>
+            </w:r>
+            <w:r>
+              <w:t xml:space="preserve">payment</w:t>
             </w:r>
           </w:p>
         </w:tc>
@@ -1838,40 +2110,7 @@
           <w:p>
             <w:pPr>
               <w:pStyle w:val="Compact"/>
-            </w:pPr>
-            <w:r>
-              <w:t xml:space="preserve">🔵</w:t>
-            </w:r>
-            <w:r>
-              <w:t xml:space="preserve"> </w:t>
-            </w:r>
-            <w:r>
-              <w:rPr>
-                <w:b/>
-                <w:bCs/>
-              </w:rPr>
-              <w:t xml:space="preserve">Approved</w:t>
-            </w:r>
-          </w:p>
-        </w:tc>
-        <w:tc>
-          <w:tcPr/>
-          <w:p>
-            <w:pPr>
-              <w:pStyle w:val="Compact"/>
-            </w:pPr>
-            <w:r>
-              <w:t xml:space="preserve">The admin reviewed it and approved it. Payment is being arranged.</w:t>
-            </w:r>
-          </w:p>
-        </w:tc>
-      </w:tr>
-      <w:tr>
-        <w:tc>
-          <w:tcPr/>
-          <w:p>
-            <w:pPr>
-              <w:pStyle w:val="Compact"/>
+              <w:jc w:val="left"/>
             </w:pPr>
             <w:r>
               <w:t xml:space="preserve">🟢</w:t>
@@ -1893,43 +2132,16 @@
           <w:p>
             <w:pPr>
               <w:pStyle w:val="Compact"/>
+              <w:jc w:val="left"/>
             </w:pPr>
             <w:r>
-              <w:t xml:space="preserve">Payment has been issued. You’re done.</w:t>
-            </w:r>
-          </w:p>
-        </w:tc>
-      </w:tr>
-      <w:tr>
-        <w:tc>
-          <w:tcPr/>
-          <w:p>
-            <w:pPr>
-              <w:pStyle w:val="Compact"/>
-            </w:pPr>
-            <w:r>
-              <w:t xml:space="preserve">🔴</w:t>
+              <w:t xml:space="preserve">Payment has been issued.</w:t>
             </w:r>
             <w:r>
               <w:t xml:space="preserve"> </w:t>
             </w:r>
             <w:r>
-              <w:rPr>
-                <w:b/>
-                <w:bCs/>
-              </w:rPr>
-              <w:t xml:space="preserve">Rejected</w:t>
-            </w:r>
-          </w:p>
-        </w:tc>
-        <w:tc>
-          <w:tcPr/>
-          <w:p>
-            <w:pPr>
-              <w:pStyle w:val="Compact"/>
-            </w:pPr>
-            <w:r>
-              <w:t xml:space="preserve">The admin rejected it. A note explains why — shown in an amber box right on the invoice card.</w:t>
+              <w:t xml:space="preserve">You’re done.</w:t>
             </w:r>
           </w:p>
         </w:tc>
@@ -1944,13 +2156,25 @@
           <w:b/>
           <w:bCs/>
         </w:rPr>
-        <w:t xml:space="preserve">If rejected:</w:t>
-      </w:r>
-      <w:r>
-        <w:t xml:space="preserve"> </w:t>
-      </w:r>
-      <w:r>
-        <w:t xml:space="preserve">read the note, fix whatever was wrong (wrong property, unclear invoice, missing detail, etc.), and submit a new invoice. The old rejected one stays in your list so you have a record.</w:t>
+        <w:t xml:space="preserve">If something was wrong with the invoice</w:t>
+      </w:r>
+      <w:r>
+        <w:t xml:space="preserve"> </w:t>
+      </w:r>
+      <w:r>
+        <w:t xml:space="preserve">(wrong property, unclear</w:t>
+      </w:r>
+      <w:r>
+        <w:t xml:space="preserve"> </w:t>
+      </w:r>
+      <w:r>
+        <w:t xml:space="preserve">scan, missing detail), message your admin and ask them to flip the</w:t>
+      </w:r>
+      <w:r>
+        <w:t xml:space="preserve"> </w:t>
+      </w:r>
+      <w:r>
+        <w:t xml:space="preserve">invoice back to Pending or delete it, then submit a corrected one.</w:t>
       </w:r>
     </w:p>
     <w:p>
@@ -1992,13 +2216,31 @@
         <w:t xml:space="preserve"> </w:t>
       </w:r>
       <w:r>
-        <w:t xml:space="preserve">lists every invoice you’ve submitted, newest first, with a status badge on each one. You can come back as often as you want — you don’t have to email the admin to ask</w:t>
-      </w:r>
-      <w:r>
-        <w:t xml:space="preserve"> </w:t>
-      </w:r>
-      <w:r>
-        <w:t xml:space="preserve">“did you get it?”</w:t>
+        <w:t xml:space="preserve">lists every invoice you’ve submitted,</w:t>
+      </w:r>
+      <w:r>
+        <w:t xml:space="preserve"> </w:t>
+      </w:r>
+      <w:r>
+        <w:t xml:space="preserve">newest first, with a status badge on each one. You can come back as</w:t>
+      </w:r>
+      <w:r>
+        <w:t xml:space="preserve"> </w:t>
+      </w:r>
+      <w:r>
+        <w:t xml:space="preserve">often as you want — you don’t have to email the admin to ask</w:t>
+      </w:r>
+      <w:r>
+        <w:t xml:space="preserve"> </w:t>
+      </w:r>
+      <w:r>
+        <w:t xml:space="preserve">“did you</w:t>
+      </w:r>
+      <w:r>
+        <w:t xml:space="preserve"> </w:t>
+      </w:r>
+      <w:r>
+        <w:t xml:space="preserve">get it?”</w:t>
       </w:r>
     </w:p>
     <w:p>
@@ -2052,7 +2294,19 @@
         <w:t xml:space="preserve"> </w:t>
       </w:r>
       <w:r>
-        <w:t xml:space="preserve">badge once the admin confirms reimbursement/payment. No badge means it’s still waiting. The admin sees a</w:t>
+        <w:t xml:space="preserve">badge</w:t>
+      </w:r>
+      <w:r>
+        <w:t xml:space="preserve"> </w:t>
+      </w:r>
+      <w:r>
+        <w:t xml:space="preserve">once the admin confirms reimbursement/payment. No badge means it’s still</w:t>
+      </w:r>
+      <w:r>
+        <w:t xml:space="preserve"> </w:t>
+      </w:r>
+      <w:r>
+        <w:t xml:space="preserve">waiting. The admin sees a</w:t>
       </w:r>
       <w:r>
         <w:t xml:space="preserve"> </w:t>
@@ -2064,7 +2318,13 @@
         <w:t xml:space="preserve"> </w:t>
       </w:r>
       <w:r>
-        <w:t xml:space="preserve">button on their side and toggles it when payment goes out.</w:t>
+        <w:t xml:space="preserve">button on their side and toggles</w:t>
+      </w:r>
+      <w:r>
+        <w:t xml:space="preserve"> </w:t>
+      </w:r>
+      <w:r>
+        <w:t xml:space="preserve">it when payment goes out.</w:t>
       </w:r>
     </w:p>
     <w:p>
@@ -2105,7 +2365,13 @@
         <w:t xml:space="preserve"> </w:t>
       </w:r>
       <w:r>
-        <w:t xml:space="preserve">(gear icon, top right) →</w:t>
+        <w:t xml:space="preserve">(gear icon,</w:t>
+      </w:r>
+      <w:r>
+        <w:t xml:space="preserve"> </w:t>
+      </w:r>
+      <w:r>
+        <w:t xml:space="preserve">top right) →</w:t>
       </w:r>
       <w:r>
         <w:t xml:space="preserve"> </w:t>
@@ -2121,7 +2387,19 @@
         <w:t xml:space="preserve"> </w:t>
       </w:r>
       <w:r>
-        <w:t xml:space="preserve">and pick the one you want. The whole app — buttons, labels, help text — swaps immediately. Your choice is remembered.</w:t>
+        <w:t xml:space="preserve">and pick the one you want. The whole app —</w:t>
+      </w:r>
+      <w:r>
+        <w:t xml:space="preserve"> </w:t>
+      </w:r>
+      <w:r>
+        <w:t xml:space="preserve">buttons, labels, help text — swaps immediately. Your choice is</w:t>
+      </w:r>
+      <w:r>
+        <w:t xml:space="preserve"> </w:t>
+      </w:r>
+      <w:r>
+        <w:t xml:space="preserve">remembered.</w:t>
       </w:r>
     </w:p>
     <w:p>
@@ -2195,7 +2473,19 @@
         <w:t xml:space="preserve"> </w:t>
       </w:r>
       <w:r>
-        <w:t xml:space="preserve">— if you forget your password, you can reset it yourself instead of bothering the admin.</w:t>
+        <w:t xml:space="preserve">— if you</w:t>
+      </w:r>
+      <w:r>
+        <w:t xml:space="preserve"> </w:t>
+      </w:r>
+      <w:r>
+        <w:t xml:space="preserve">forget your password, you can reset it yourself instead of bothering the</w:t>
+      </w:r>
+      <w:r>
+        <w:t xml:space="preserve"> </w:t>
+      </w:r>
+      <w:r>
+        <w:t xml:space="preserve">admin.</w:t>
       </w:r>
     </w:p>
     <w:p>
@@ -2337,7 +2627,13 @@
         <w:pStyle w:val="FirstParagraph"/>
       </w:pPr>
       <w:r>
-        <w:t xml:space="preserve">Pick something you’ll remember. If you use a password manager, save it there.</w:t>
+        <w:t xml:space="preserve">Pick something you’ll remember. If you use a password manager, save it</w:t>
+      </w:r>
+      <w:r>
+        <w:t xml:space="preserve"> </w:t>
+      </w:r>
+      <w:r>
+        <w:t xml:space="preserve">there.</w:t>
       </w:r>
     </w:p>
     <w:p>
@@ -2363,7 +2659,13 @@
         <w:pStyle w:val="FirstParagraph"/>
       </w:pPr>
       <w:r>
-        <w:t xml:space="preserve">The app uses AI to read your receipts and invoices. It’s good, but it’s not perfect. Here’s how to help it:</w:t>
+        <w:t xml:space="preserve">The app uses AI to read your receipts and invoices. It’s good, but it’s</w:t>
+      </w:r>
+      <w:r>
+        <w:t xml:space="preserve"> </w:t>
+      </w:r>
+      <w:r>
+        <w:t xml:space="preserve">not perfect. Here’s how to help it:</w:t>
       </w:r>
     </w:p>
     <w:p>
@@ -2385,7 +2687,13 @@
         <w:t xml:space="preserve"> </w:t>
       </w:r>
       <w:r>
-        <w:t xml:space="preserve">Avoid glare, shadows, and heavy reflections. Daylight or a bright indoor light is ideal.</w:t>
+        <w:t xml:space="preserve">Avoid glare, shadows, and heavy reflections.</w:t>
+      </w:r>
+      <w:r>
+        <w:t xml:space="preserve"> </w:t>
+      </w:r>
+      <w:r>
+        <w:t xml:space="preserve">Daylight or a bright indoor light is ideal.</w:t>
       </w:r>
     </w:p>
     <w:p>
@@ -2407,7 +2715,13 @@
         <w:t xml:space="preserve"> </w:t>
       </w:r>
       <w:r>
-        <w:t xml:space="preserve">Smooth out crumpled receipts before photographing them.</w:t>
+        <w:t xml:space="preserve">Smooth out crumpled receipts before photographing</w:t>
+      </w:r>
+      <w:r>
+        <w:t xml:space="preserve"> </w:t>
+      </w:r>
+      <w:r>
+        <w:t xml:space="preserve">them.</w:t>
       </w:r>
     </w:p>
     <w:p>
@@ -2429,7 +2743,13 @@
         <w:t xml:space="preserve"> </w:t>
       </w:r>
       <w:r>
-        <w:t xml:space="preserve">Tilted photos are harder to read. Keep the camera parallel to the paper.</w:t>
+        <w:t xml:space="preserve">Tilted photos are harder to read. Keep the</w:t>
+      </w:r>
+      <w:r>
+        <w:t xml:space="preserve"> </w:t>
+      </w:r>
+      <w:r>
+        <w:t xml:space="preserve">camera parallel to the paper.</w:t>
       </w:r>
     </w:p>
     <w:p>
@@ -2451,7 +2771,19 @@
         <w:t xml:space="preserve"> </w:t>
       </w:r>
       <w:r>
-        <w:t xml:space="preserve">If you have a thermal-paper receipt (the shiny kind from gas stations and stores), scan or photograph it the same day. They turn blank in weeks.</w:t>
+        <w:t xml:space="preserve">If you have a thermal-paper receipt</w:t>
+      </w:r>
+      <w:r>
+        <w:t xml:space="preserve"> </w:t>
+      </w:r>
+      <w:r>
+        <w:t xml:space="preserve">(the shiny kind from gas stations and stores), scan or photograph it</w:t>
+      </w:r>
+      <w:r>
+        <w:t xml:space="preserve"> </w:t>
+      </w:r>
+      <w:r>
+        <w:t xml:space="preserve">the same day. They turn blank in weeks.</w:t>
       </w:r>
     </w:p>
     <w:p>
@@ -2489,7 +2821,19 @@
         <w:t xml:space="preserve"> </w:t>
       </w:r>
       <w:r>
-        <w:t xml:space="preserve">file you upload. If you attach a blurry photo first and a clear one second, it’ll use the blurry one. Upload the clearest copy first.</w:t>
+        <w:t xml:space="preserve">file you upload. If</w:t>
+      </w:r>
+      <w:r>
+        <w:t xml:space="preserve"> </w:t>
+      </w:r>
+      <w:r>
+        <w:t xml:space="preserve">you attach a blurry photo first and a clear one second, it’ll use the</w:t>
+      </w:r>
+      <w:r>
+        <w:t xml:space="preserve"> </w:t>
+      </w:r>
+      <w:r>
+        <w:t xml:space="preserve">blurry one. Upload the clearest copy first.</w:t>
       </w:r>
     </w:p>
     <w:p>
@@ -2511,7 +2855,13 @@
         <w:t xml:space="preserve"> </w:t>
       </w:r>
       <w:r>
-        <w:t xml:space="preserve">Don’t screenshot a Word document; export it as a PDF and upload that. The text stays sharp.</w:t>
+        <w:t xml:space="preserve">Don’t screenshot a Word</w:t>
+      </w:r>
+      <w:r>
+        <w:t xml:space="preserve"> </w:t>
+      </w:r>
+      <w:r>
+        <w:t xml:space="preserve">document; export it as a PDF and upload that. The text stays sharp.</w:t>
       </w:r>
     </w:p>
     <w:p>
@@ -2533,7 +2883,13 @@
         <w:t xml:space="preserve"> </w:t>
       </w:r>
       <w:r>
-        <w:t xml:space="preserve">The OCR will try to pick them up and put them in the notes field — review and tidy them up.</w:t>
+        <w:t xml:space="preserve">The OCR will try to pick them up and</w:t>
+      </w:r>
+      <w:r>
+        <w:t xml:space="preserve"> </w:t>
+      </w:r>
+      <w:r>
+        <w:t xml:space="preserve">put them in the notes field — review and tidy them up.</w:t>
       </w:r>
     </w:p>
     <w:p>
@@ -2578,13 +2934,33 @@
           <w:b/>
           <w:bCs/>
         </w:rPr>
-        <w:t xml:space="preserve">Forgot password?</w:t>
-      </w:r>
-      <w:r>
-        <w:t xml:space="preserve"> </w:t>
-      </w:r>
-      <w:r>
-        <w:t xml:space="preserve">on the sign-in screen. If not, ask your admin to reset it — then add an email so you can reset it yourself next time.</w:t>
+        <w:t xml:space="preserve">Forgot</w:t>
+      </w:r>
+      <w:r>
+        <w:rPr>
+          <w:b/>
+          <w:bCs/>
+        </w:rPr>
+        <w:t xml:space="preserve"> </w:t>
+      </w:r>
+      <w:r>
+        <w:rPr>
+          <w:b/>
+          <w:bCs/>
+        </w:rPr>
+        <w:t xml:space="preserve">password?</w:t>
+      </w:r>
+      <w:r>
+        <w:t xml:space="preserve"> </w:t>
+      </w:r>
+      <w:r>
+        <w:t xml:space="preserve">on the sign-in screen. If not, ask your admin to reset it</w:t>
+      </w:r>
+      <w:r>
+        <w:t xml:space="preserve"> </w:t>
+      </w:r>
+      <w:r>
+        <w:t xml:space="preserve">— then add an email so you can reset it yourself next time.</w:t>
       </w:r>
     </w:p>
     <w:p>
@@ -2602,7 +2978,13 @@
         <w:t xml:space="preserve"> </w:t>
       </w:r>
       <w:r>
-        <w:t xml:space="preserve">A: Your admin needs to assign you to that property. Message them.</w:t>
+        <w:t xml:space="preserve">A: Your admin needs to</w:t>
+      </w:r>
+      <w:r>
+        <w:t xml:space="preserve"> </w:t>
+      </w:r>
+      <w:r>
+        <w:t xml:space="preserve">assign you to that property. Message them.</w:t>
       </w:r>
     </w:p>
     <w:p>
@@ -2620,7 +3002,19 @@
         <w:t xml:space="preserve"> </w:t>
       </w:r>
       <w:r>
-        <w:t xml:space="preserve">A: Supported formats are JPG, PNG, WebP, and PDF. Very large files (over ~10 MB) may time out — try a slightly smaller photo. Password-protected PDFs won’t work.</w:t>
+        <w:t xml:space="preserve">A: Supported formats are JPG, PNG, WebP,</w:t>
+      </w:r>
+      <w:r>
+        <w:t xml:space="preserve"> </w:t>
+      </w:r>
+      <w:r>
+        <w:t xml:space="preserve">and PDF. Very large files (over ~10 MB) may time out — try a slightly</w:t>
+      </w:r>
+      <w:r>
+        <w:t xml:space="preserve"> </w:t>
+      </w:r>
+      <w:r>
+        <w:t xml:space="preserve">smaller photo. Password-protected PDFs won’t work.</w:t>
       </w:r>
     </w:p>
     <w:p>
@@ -2638,7 +3032,13 @@
         <w:t xml:space="preserve"> </w:t>
       </w:r>
       <w:r>
-        <w:t xml:space="preserve">A: Just fix it before saving. It’s totally normal — no receipt is perfectly readable every time.</w:t>
+        <w:t xml:space="preserve">A: Just fix it before saving. It’s</w:t>
+      </w:r>
+      <w:r>
+        <w:t xml:space="preserve"> </w:t>
+      </w:r>
+      <w:r>
+        <w:t xml:space="preserve">totally normal — no receipt is perfectly readable every time.</w:t>
       </w:r>
     </w:p>
     <w:p>
@@ -2656,7 +3056,25 @@
         <w:t xml:space="preserve"> </w:t>
       </w:r>
       <w:r>
-        <w:t xml:space="preserve">A: Contractors can’t edit or delete submitted invoices (to keep the audit trail clean). Message your admin and ask them to reject the invoice with a note explaining what happened; then submit a corrected one.</w:t>
+        <w:t xml:space="preserve">A:</w:t>
+      </w:r>
+      <w:r>
+        <w:t xml:space="preserve"> </w:t>
+      </w:r>
+      <w:r>
+        <w:t xml:space="preserve">Contractors can’t edit or delete submitted invoices (to keep the audit</w:t>
+      </w:r>
+      <w:r>
+        <w:t xml:space="preserve"> </w:t>
+      </w:r>
+      <w:r>
+        <w:t xml:space="preserve">trail clean). Message your admin and ask them to reject the invoice with</w:t>
+      </w:r>
+      <w:r>
+        <w:t xml:space="preserve"> </w:t>
+      </w:r>
+      <w:r>
+        <w:t xml:space="preserve">a note explaining what happened; then submit a corrected one.</w:t>
       </w:r>
     </w:p>
     <w:p>
@@ -2674,7 +3092,13 @@
         <w:t xml:space="preserve"> </w:t>
       </w:r>
       <w:r>
-        <w:t xml:space="preserve">A: Deletions are permanent — there’s no undo. Be careful when you tap</w:t>
+        <w:t xml:space="preserve">A: Deletions are permanent —</w:t>
+      </w:r>
+      <w:r>
+        <w:t xml:space="preserve"> </w:t>
+      </w:r>
+      <w:r>
+        <w:t xml:space="preserve">there’s no undo. Be careful when you tap</w:t>
       </w:r>
       <w:r>
         <w:t xml:space="preserve"> </w:t>
@@ -2699,13 +3123,33 @@
           <w:b/>
           <w:bCs/>
         </w:rPr>
-        <w:t xml:space="preserve">Q: My invoice says Rejected. What do I do?</w:t>
-      </w:r>
-      <w:r>
-        <w:t xml:space="preserve"> </w:t>
-      </w:r>
-      <w:r>
-        <w:t xml:space="preserve">A: Read the note (shown in an amber box on the invoice card) — it explains why. Fix the issue and submit a fresh invoice. The rejected one stays in your history.</w:t>
+        <w:t xml:space="preserve">Q: Can I tell whether an invoice has been paid without opening the</w:t>
+      </w:r>
+      <w:r>
+        <w:rPr>
+          <w:b/>
+          <w:bCs/>
+        </w:rPr>
+        <w:t xml:space="preserve"> </w:t>
+      </w:r>
+      <w:r>
+        <w:rPr>
+          <w:b/>
+          <w:bCs/>
+        </w:rPr>
+        <w:t xml:space="preserve">app?</w:t>
+      </w:r>
+      <w:r>
+        <w:t xml:space="preserve"> </w:t>
+      </w:r>
+      <w:r>
+        <w:t xml:space="preserve">A: Not right now — the app doesn’t email or text you. Check the</w:t>
+      </w:r>
+      <w:r>
+        <w:t xml:space="preserve"> </w:t>
+      </w:r>
+      <w:r>
+        <w:t xml:space="preserve">app periodically. We may add notifications later.</w:t>
       </w:r>
     </w:p>
     <w:p>
@@ -2717,13 +3161,39 @@
           <w:b/>
           <w:bCs/>
         </w:rPr>
-        <w:t xml:space="preserve">Q: Can I tell whether an invoice has been paid without opening the app?</w:t>
-      </w:r>
-      <w:r>
-        <w:t xml:space="preserve"> </w:t>
-      </w:r>
-      <w:r>
-        <w:t xml:space="preserve">A: Not right now — the app doesn’t email or text you. Check the app periodically. We may add notifications later.</w:t>
+        <w:t xml:space="preserve">Q: My phone doesn’t have a camera app that exports PDF. How do I</w:t>
+      </w:r>
+      <w:r>
+        <w:rPr>
+          <w:b/>
+          <w:bCs/>
+        </w:rPr>
+        <w:t xml:space="preserve"> </w:t>
+      </w:r>
+      <w:r>
+        <w:rPr>
+          <w:b/>
+          <w:bCs/>
+        </w:rPr>
+        <w:t xml:space="preserve">submit an invoice?</w:t>
+      </w:r>
+      <w:r>
+        <w:t xml:space="preserve"> </w:t>
+      </w:r>
+      <w:r>
+        <w:t xml:space="preserve">A: Take a photo of the invoice with your normal</w:t>
+      </w:r>
+      <w:r>
+        <w:t xml:space="preserve"> </w:t>
+      </w:r>
+      <w:r>
+        <w:t xml:space="preserve">camera and upload the JPG — that works fine. PDFs are preferred but</w:t>
+      </w:r>
+      <w:r>
+        <w:t xml:space="preserve"> </w:t>
+      </w:r>
+      <w:r>
+        <w:t xml:space="preserve">not required.</w:t>
       </w:r>
     </w:p>
     <w:p>
@@ -2735,13 +3205,19 @@
           <w:b/>
           <w:bCs/>
         </w:rPr>
-        <w:t xml:space="preserve">Q: My phone doesn’t have a camera app that exports PDF. How do I submit an invoice?</w:t>
-      </w:r>
-      <w:r>
-        <w:t xml:space="preserve"> </w:t>
-      </w:r>
-      <w:r>
-        <w:t xml:space="preserve">A: Take a photo of the invoice with your normal camera and upload the JPG — that works fine. PDFs are preferred but not required.</w:t>
+        <w:t xml:space="preserve">Q: I submitted the same invoice twice.</w:t>
+      </w:r>
+      <w:r>
+        <w:t xml:space="preserve"> </w:t>
+      </w:r>
+      <w:r>
+        <w:t xml:space="preserve">A: Ask the admin to reject</w:t>
+      </w:r>
+      <w:r>
+        <w:t xml:space="preserve"> </w:t>
+      </w:r>
+      <w:r>
+        <w:t xml:space="preserve">the duplicate. Don’t worry — it happens.</w:t>
       </w:r>
     </w:p>
     <w:p>
@@ -2753,31 +3229,19 @@
           <w:b/>
           <w:bCs/>
         </w:rPr>
-        <w:t xml:space="preserve">Q: I submitted the same invoice twice.</w:t>
-      </w:r>
-      <w:r>
-        <w:t xml:space="preserve"> </w:t>
-      </w:r>
-      <w:r>
-        <w:t xml:space="preserve">A: Ask the admin to reject the duplicate. Don’t worry — it happens.</w:t>
-      </w:r>
-    </w:p>
-    <w:p>
-      <w:pPr>
-        <w:pStyle w:val="BodyText"/>
-      </w:pPr>
-      <w:r>
-        <w:rPr>
-          <w:b/>
-          <w:bCs/>
-        </w:rPr>
         <w:t xml:space="preserve">Q: Can I use this on a computer as well as my phone?</w:t>
       </w:r>
       <w:r>
         <w:t xml:space="preserve"> </w:t>
       </w:r>
       <w:r>
-        <w:t xml:space="preserve">A: Yes. Same URL, same login, same features. The layout adjusts for the screen size.</w:t>
+        <w:t xml:space="preserve">A: Yes. Same</w:t>
+      </w:r>
+      <w:r>
+        <w:t xml:space="preserve"> </w:t>
+      </w:r>
+      <w:r>
+        <w:t xml:space="preserve">URL, same login, same features. The layout adjusts for the screen size.</w:t>
       </w:r>
     </w:p>
     <w:p>
@@ -2822,7 +3286,13 @@
         <w:t xml:space="preserve"> </w:t>
       </w:r>
       <w:r>
-        <w:t xml:space="preserve">in the top-right of any screen to see this guide inside the app.</w:t>
+        <w:t xml:space="preserve">in the top-right of any screen to see this guide inside</w:t>
+      </w:r>
+      <w:r>
+        <w:t xml:space="preserve"> </w:t>
+      </w:r>
+      <w:r>
+        <w:t xml:space="preserve">the app.</w:t>
       </w:r>
     </w:p>
     <w:p>
@@ -2834,7 +3304,13 @@
         </w:numPr>
       </w:pPr>
       <w:r>
-        <w:t xml:space="preserve">For anything the app can’t help with — wrong amount paid, disputed work, questions about a property — contact your admin directly.</w:t>
+        <w:t xml:space="preserve">For anything the app can’t help with — wrong amount paid, disputed</w:t>
+      </w:r>
+      <w:r>
+        <w:t xml:space="preserve"> </w:t>
+      </w:r>
+      <w:r>
+        <w:t xml:space="preserve">work, questions about a property — contact your admin directly.</w:t>
       </w:r>
     </w:p>
     <w:p>
@@ -2842,7 +3318,13 @@
         <w:pStyle w:val="FirstParagraph"/>
       </w:pPr>
       <w:r>
-        <w:t xml:space="preserve">Thanks for using LedgerX. Keep it simple: photo in, check the fields, pick the property, hit Save.</w:t>
+        <w:t xml:space="preserve">Thanks for using LedgerX. Keep it simple: photo in, check the fields,</w:t>
+      </w:r>
+      <w:r>
+        <w:t xml:space="preserve"> </w:t>
+      </w:r>
+      <w:r>
+        <w:t xml:space="preserve">pick the property, hit Save.</w:t>
       </w:r>
     </w:p>
     <w:bookmarkEnd w:id="25"/>

</xml_diff>

<commit_message>
docs: regenerate offline user guides for v5.6
- Contractor guide (EN + pt-BR): add optional Category picker step to
  invoice submission, plus a paragraph on tap-to-open invoice detail
  panel with attachments.
- Household admin guide: rewrite "Submitting Your Own Receipts and
  Invoices" to point at the new Add Transaction + Submit Invoice
  buttons now shown in the admin panel header, and add the Category
  picker step.

Co-Authored-By: Claude Opus 4.7 <noreply@anthropic.com>
</commit_message>
<xml_diff>
--- a/docs/CONTRACTOR_GUIDE.docx
+++ b/docs/CONTRACTOR_GUIDE.docx
@@ -625,7 +625,13 @@
         <w:t xml:space="preserve">Paid</w:t>
       </w:r>
       <w:r>
-        <w:t xml:space="preserve">, or if a receipt has been marked as paid.</w:t>
+        <w:t xml:space="preserve">,</w:t>
+      </w:r>
+      <w:r>
+        <w:t xml:space="preserve"> </w:t>
+      </w:r>
+      <w:r>
+        <w:t xml:space="preserve">or if a receipt has been marked as paid.</w:t>
       </w:r>
     </w:p>
     <w:p>
@@ -996,13 +1002,13 @@
     <w:tbl>
       <w:tblPr>
         <w:tblStyle w:val="Table"/>
-        <w:tblW w:type="pct" w:w="4306"/>
+        <w:tblW w:type="pct" w:w="3611"/>
         <w:tblLayout w:type="fixed"/>
         <w:tblLook w:firstRow="1" w:lastRow="0" w:firstColumn="0" w:lastColumn="0" w:noHBand="0" w:noVBand="0" w:val="0020"/>
       </w:tblPr>
       <w:tblGrid>
-        <w:gridCol w:w="3410"/>
-        <w:gridCol w:w="3410"/>
+        <w:gridCol w:w="2860"/>
+        <w:gridCol w:w="2860"/>
       </w:tblGrid>
       <w:tr>
         <w:trPr>
@@ -1058,19 +1064,19 @@
               <w:jc w:val="left"/>
             </w:pPr>
             <w:r>
-              <w:t xml:space="preserve">Log a receipt for something</w:t>
+              <w:t xml:space="preserve">Log a receipt for</w:t>
             </w:r>
             <w:r>
               <w:t xml:space="preserve"> </w:t>
             </w:r>
             <w:r>
-              <w:t xml:space="preserve">you bought on behalf of a</w:t>
+              <w:t xml:space="preserve">something you bought on</w:t>
             </w:r>
             <w:r>
               <w:t xml:space="preserve"> </w:t>
             </w:r>
             <w:r>
-              <w:t xml:space="preserve">property</w:t>
+              <w:t xml:space="preserve">behalf of a property</w:t>
             </w:r>
           </w:p>
         </w:tc>
@@ -1100,13 +1106,13 @@
               <w:jc w:val="left"/>
             </w:pPr>
             <w:r>
-              <w:t xml:space="preserve">Send your invoice (bill) for</w:t>
+              <w:t xml:space="preserve">Send your invoice (bill)</w:t>
             </w:r>
             <w:r>
               <w:t xml:space="preserve"> </w:t>
             </w:r>
             <w:r>
-              <w:t xml:space="preserve">work you performed</w:t>
+              <w:t xml:space="preserve">for work you performed</w:t>
             </w:r>
           </w:p>
         </w:tc>
@@ -1949,6 +1955,52 @@
         </w:numPr>
       </w:pPr>
       <w:r>
+        <w:t xml:space="preserve">Optionally pick a</w:t>
+      </w:r>
+      <w:r>
+        <w:t xml:space="preserve"> </w:t>
+      </w:r>
+      <w:r>
+        <w:rPr>
+          <w:b/>
+          <w:bCs/>
+        </w:rPr>
+        <w:t xml:space="preserve">Category</w:t>
+      </w:r>
+      <w:r>
+        <w:t xml:space="preserve"> </w:t>
+      </w:r>
+      <w:r>
+        <w:t xml:space="preserve">(e.g. Plumbing, Materials,</w:t>
+      </w:r>
+      <w:r>
+        <w:t xml:space="preserve"> </w:t>
+      </w:r>
+      <w:r>
+        <w:t xml:space="preserve">Utilities). Only categories available for the property you just</w:t>
+      </w:r>
+      <w:r>
+        <w:t xml:space="preserve"> </w:t>
+      </w:r>
+      <w:r>
+        <w:t xml:space="preserve">selected are shown. Leaving this blank is fine — a full admin can</w:t>
+      </w:r>
+      <w:r>
+        <w:t xml:space="preserve"> </w:t>
+      </w:r>
+      <w:r>
+        <w:t xml:space="preserve">assign one later. If you change the property, the category resets.</w:t>
+      </w:r>
+    </w:p>
+    <w:p>
+      <w:pPr>
+        <w:pStyle w:val="Compact"/>
+        <w:numPr>
+          <w:ilvl w:val="0"/>
+          <w:numId w:val="1010"/>
+        </w:numPr>
+      </w:pPr>
+      <w:r>
         <w:t xml:space="preserve">Tap</w:t>
       </w:r>
       <w:r>
@@ -2025,13 +2077,13 @@
     <w:tbl>
       <w:tblPr>
         <w:tblStyle w:val="Table"/>
-        <w:tblW w:type="pct" w:w="4306"/>
+        <w:tblW w:type="pct" w:w="3611"/>
         <w:tblLayout w:type="fixed"/>
         <w:tblLook w:firstRow="1" w:lastRow="0" w:firstColumn="0" w:lastColumn="0" w:noHBand="0" w:noVBand="0" w:val="0020"/>
       </w:tblPr>
       <w:tblGrid>
-        <w:gridCol w:w="3410"/>
-        <w:gridCol w:w="3410"/>
+        <w:gridCol w:w="2860"/>
+        <w:gridCol w:w="2860"/>
       </w:tblGrid>
       <w:tr>
         <w:trPr>
@@ -2241,6 +2293,54 @@
       </w:r>
       <w:r>
         <w:t xml:space="preserve">get it?”</w:t>
+      </w:r>
+    </w:p>
+    <w:p>
+      <w:pPr>
+        <w:pStyle w:val="BodyText"/>
+      </w:pPr>
+      <w:r>
+        <w:rPr>
+          <w:b/>
+          <w:bCs/>
+        </w:rPr>
+        <w:t xml:space="preserve">Tap any invoice row to see the full details.</w:t>
+      </w:r>
+      <w:r>
+        <w:t xml:space="preserve"> </w:t>
+      </w:r>
+      <w:r>
+        <w:t xml:space="preserve">A read-only panel</w:t>
+      </w:r>
+      <w:r>
+        <w:t xml:space="preserve"> </w:t>
+      </w:r>
+      <w:r>
+        <w:t xml:space="preserve">opens showing the invoice number, property, category, amount, status</w:t>
+      </w:r>
+      <w:r>
+        <w:t xml:space="preserve"> </w:t>
+      </w:r>
+      <w:r>
+        <w:t xml:space="preserve">badge, service period, submitted date, paid date (if paid), description,</w:t>
+      </w:r>
+      <w:r>
+        <w:t xml:space="preserve"> </w:t>
+      </w:r>
+      <w:r>
+        <w:t xml:space="preserve">any admin notes, and every attachment. PDF attachments open in a new</w:t>
+      </w:r>
+      <w:r>
+        <w:t xml:space="preserve"> </w:t>
+      </w:r>
+      <w:r>
+        <w:t xml:space="preserve">tab; photos open inline. Good for double-checking what you sent or</w:t>
+      </w:r>
+      <w:r>
+        <w:t xml:space="preserve"> </w:t>
+      </w:r>
+      <w:r>
+        <w:t xml:space="preserve">pulling up an old invoice on the go.</w:t>
       </w:r>
     </w:p>
     <w:p>

</xml_diff>

<commit_message>
docs: update remaining ledger.phillyshah.com refs to ledger.90ten.life
- README.md: fix stale rsync target in Deploy section
- docs/*.docx (Contractor en+pt-BR, Household Admin, User Guide):
  swap sign-in URL to ledger.90ten.life via pandoc roundtrip

CLAUDE.md and QUICK_START.md keep their phillyshah.com references —
those describe the legacy 301 redirect setup intentionally.

Co-Authored-By: Claude Opus 4.7 <noreply@anthropic.com>
</commit_message>
<xml_diff>
--- a/docs/CONTRACTOR_GUIDE.docx
+++ b/docs/CONTRACTOR_GUIDE.docx
@@ -488,7 +488,7 @@
           <w:b/>
           <w:bCs/>
         </w:rPr>
-        <w:t xml:space="preserve">ledger.phillyshah.com</w:t>
+        <w:t xml:space="preserve">ledger.90ten.life</w:t>
       </w:r>
       <w:r>
         <w:t xml:space="preserve">, sign in with your username and</w:t>
@@ -684,7 +684,7 @@
           <w:b/>
           <w:bCs/>
         </w:rPr>
-        <w:t xml:space="preserve">ledger.phillyshah.com</w:t>
+        <w:t xml:space="preserve">ledger.90ten.life</w:t>
       </w:r>
       <w:r>
         <w:t xml:space="preserve">.</w:t>
@@ -1002,13 +1002,13 @@
     <w:tbl>
       <w:tblPr>
         <w:tblStyle w:val="Table"/>
-        <w:tblW w:type="pct" w:w="3056"/>
+        <w:tblW w:type="pct" w:w="2639"/>
         <w:tblLayout w:type="fixed"/>
         <w:tblLook w:firstRow="1" w:lastRow="0" w:firstColumn="0" w:lastColumn="0" w:noHBand="0" w:noVBand="0" w:val="0020"/>
       </w:tblPr>
       <w:tblGrid>
-        <w:gridCol w:w="2420"/>
-        <w:gridCol w:w="2420"/>
+        <w:gridCol w:w="2090"/>
+        <w:gridCol w:w="2090"/>
       </w:tblGrid>
       <w:tr>
         <w:trPr>
@@ -1052,7 +1052,21 @@
                 <w:b/>
                 <w:bCs/>
               </w:rPr>
-              <w:t xml:space="preserve">Add Transaction</w:t>
+              <w:t xml:space="preserve">Add</w:t>
+            </w:r>
+            <w:r>
+              <w:rPr>
+                <w:b/>
+                <w:bCs/>
+              </w:rPr>
+              <w:t xml:space="preserve"> </w:t>
+            </w:r>
+            <w:r>
+              <w:rPr>
+                <w:b/>
+                <w:bCs/>
+              </w:rPr>
+              <w:t xml:space="preserve">Transaction</w:t>
             </w:r>
           </w:p>
         </w:tc>
@@ -1070,19 +1084,19 @@
               <w:t xml:space="preserve"> </w:t>
             </w:r>
             <w:r>
-              <w:t xml:space="preserve">something you bought</w:t>
+              <w:t xml:space="preserve">something you</w:t>
             </w:r>
             <w:r>
               <w:t xml:space="preserve"> </w:t>
             </w:r>
             <w:r>
-              <w:t xml:space="preserve">on behalf of a</w:t>
+              <w:t xml:space="preserve">bought on behalf</w:t>
             </w:r>
             <w:r>
               <w:t xml:space="preserve"> </w:t>
             </w:r>
             <w:r>
-              <w:t xml:space="preserve">property</w:t>
+              <w:t xml:space="preserve">of a property</w:t>
             </w:r>
           </w:p>
         </w:tc>
@@ -1118,13 +1132,13 @@
               <w:t xml:space="preserve"> </w:t>
             </w:r>
             <w:r>
-              <w:t xml:space="preserve">(bill) for work you</w:t>
+              <w:t xml:space="preserve">(bill) for work</w:t>
             </w:r>
             <w:r>
               <w:t xml:space="preserve"> </w:t>
             </w:r>
             <w:r>
-              <w:t xml:space="preserve">performed</w:t>
+              <w:t xml:space="preserve">you performed</w:t>
             </w:r>
           </w:p>
         </w:tc>
@@ -2089,13 +2103,13 @@
     <w:tbl>
       <w:tblPr>
         <w:tblStyle w:val="Table"/>
-        <w:tblW w:type="pct" w:w="3056"/>
+        <w:tblW w:type="pct" w:w="2639"/>
         <w:tblLayout w:type="fixed"/>
         <w:tblLook w:firstRow="1" w:lastRow="0" w:firstColumn="0" w:lastColumn="0" w:noHBand="0" w:noVBand="0" w:val="0020"/>
       </w:tblPr>
       <w:tblGrid>
-        <w:gridCol w:w="2420"/>
-        <w:gridCol w:w="2420"/>
+        <w:gridCol w:w="2090"/>
+        <w:gridCol w:w="2090"/>
       </w:tblGrid>
       <w:tr>
         <w:trPr>
@@ -2157,13 +2171,19 @@
               <w:jc w:val="left"/>
             </w:pPr>
             <w:r>
-              <w:t xml:space="preserve">Submitted — waiting</w:t>
+              <w:t xml:space="preserve">Submitted —</w:t>
             </w:r>
             <w:r>
               <w:t xml:space="preserve"> </w:t>
             </w:r>
             <w:r>
-              <w:t xml:space="preserve">for payment</w:t>
+              <w:t xml:space="preserve">waiting for</w:t>
+            </w:r>
+            <w:r>
+              <w:t xml:space="preserve"> </w:t>
+            </w:r>
+            <w:r>
+              <w:t xml:space="preserve">payment</w:t>
             </w:r>
           </w:p>
         </w:tc>
@@ -2205,7 +2225,13 @@
               <w:t xml:space="preserve"> </w:t>
             </w:r>
             <w:r>
-              <w:t xml:space="preserve">issued. You’re done.</w:t>
+              <w:t xml:space="preserve">issued. You’re</w:t>
+            </w:r>
+            <w:r>
+              <w:t xml:space="preserve"> </w:t>
+            </w:r>
+            <w:r>
+              <w:t xml:space="preserve">done.</w:t>
             </w:r>
           </w:p>
         </w:tc>

</xml_diff>